<commit_message>
refactor: Usar APENAS os 9 templates finais (limpar anteriores)
Removidos: Versões antigas/duplicadas
Mantidos: 9 templates definitivos

VENDA À VISTA (3):
- venda_vista_assinatura_digital.docx
- venda_vista_assinatura_manual_2_testemunhas.docx
- venda_vista_mista_2_testemunhas.docx

VENDA PARCELADA (3):
- venda_parcelada_assinatura_digital.docx
- venda_parcelada_assinatura_manual_2_testemunhas.docx
- venda_parcelada_mista_2_testemunhas.docx

EXCLUSIVIDADE (3):
- exclusividade_assinatura_digital.docx
- exclusividade_mista_2_testemunhas.docx
- exclusividade_sem_conjuge_mista_2_testemunhas.docx

Próximo: Integrar com Supabase para armazenamento e seleção dinâmica
</commit_message>
<xml_diff>
--- a/templates/venda_parcelada_assinatura_manual_2_testemunhas.docx
+++ b/templates/venda_parcelada_assinatura_manual_2_testemunhas.docx
@@ -236,25 +236,7 @@
           <w:sz w:val="24"/>
           <w:szCs w:val="24"/>
         </w:rPr>
-        <w:t xml:space="preserve">A posse que exerce sobre 01 (um) terreno rural, extraído de uma área localizada na {localizacao_imovel}, no desmembramento do lote do </w:t>
-      </w:r>
-      <w:proofErr w:type="gramStart"/>
-      <w:r>
-        <w:rPr>
-          <w:rFonts w:asciiTheme="majorHAnsi" w:hAnsiTheme="majorHAnsi"/>
-          <w:sz w:val="24"/>
-          <w:szCs w:val="24"/>
-        </w:rPr>
-        <w:t>Empreendimento</w:t>
-      </w:r>
-      <w:proofErr w:type="gramEnd"/>
-      <w:r>
-        <w:rPr>
-          <w:rFonts w:asciiTheme="majorHAnsi" w:hAnsiTheme="majorHAnsi"/>
-          <w:sz w:val="24"/>
-          <w:szCs w:val="24"/>
-        </w:rPr>
-        <w:t xml:space="preserve"> </w:t>
+        <w:t xml:space="preserve">A posse que exerce sobre 01 (um) terreno rural, extraído de uma área localizada na {localizacao_imovel}, no desmembramento do lote do Empreendimento </w:t>
       </w:r>
       <w:r>
         <w:rPr>
@@ -2576,8 +2558,91 @@
           <w:b/>
           <w:sz w:val="24"/>
           <w:szCs w:val="24"/>
-        </w:rPr>
-      </w:pPr>
+          <w:u w:val="single"/>
+        </w:rPr>
+      </w:pPr>
+      <w:r>
+        <w:rPr>
+          <w:rFonts w:asciiTheme="majorHAnsi" w:hAnsiTheme="majorHAnsi"/>
+          <w:b/>
+          <w:sz w:val="24"/>
+          <w:szCs w:val="24"/>
+          <w:u w:val="single"/>
+        </w:rPr>
+        <w:tab/>
+      </w:r>
+      <w:r>
+        <w:rPr>
+          <w:rFonts w:asciiTheme="majorHAnsi" w:hAnsiTheme="majorHAnsi"/>
+          <w:b/>
+          <w:sz w:val="24"/>
+          <w:szCs w:val="24"/>
+          <w:u w:val="single"/>
+        </w:rPr>
+        <w:tab/>
+      </w:r>
+      <w:r>
+        <w:rPr>
+          <w:rFonts w:asciiTheme="majorHAnsi" w:hAnsiTheme="majorHAnsi"/>
+          <w:b/>
+          <w:sz w:val="24"/>
+          <w:szCs w:val="24"/>
+          <w:u w:val="single"/>
+        </w:rPr>
+        <w:tab/>
+      </w:r>
+      <w:r>
+        <w:rPr>
+          <w:rFonts w:asciiTheme="majorHAnsi" w:hAnsiTheme="majorHAnsi"/>
+          <w:b/>
+          <w:sz w:val="24"/>
+          <w:szCs w:val="24"/>
+          <w:u w:val="single"/>
+        </w:rPr>
+        <w:tab/>
+      </w:r>
+      <w:r>
+        <w:rPr>
+          <w:rFonts w:asciiTheme="majorHAnsi" w:hAnsiTheme="majorHAnsi"/>
+          <w:b/>
+          <w:sz w:val="24"/>
+          <w:szCs w:val="24"/>
+          <w:u w:val="single"/>
+        </w:rPr>
+        <w:tab/>
+      </w:r>
+      <w:r>
+        <w:rPr>
+          <w:rFonts w:asciiTheme="majorHAnsi" w:hAnsiTheme="majorHAnsi"/>
+          <w:b/>
+          <w:sz w:val="24"/>
+          <w:szCs w:val="24"/>
+          <w:u w:val="single"/>
+        </w:rPr>
+        <w:tab/>
+      </w:r>
+      <w:r>
+        <w:rPr>
+          <w:rFonts w:asciiTheme="majorHAnsi" w:hAnsiTheme="majorHAnsi"/>
+          <w:b/>
+          <w:sz w:val="24"/>
+          <w:szCs w:val="24"/>
+          <w:u w:val="single"/>
+        </w:rPr>
+        <w:tab/>
+      </w:r>
+      <w:r>
+        <w:rPr>
+          <w:rFonts w:asciiTheme="majorHAnsi" w:hAnsiTheme="majorHAnsi"/>
+          <w:b/>
+          <w:sz w:val="24"/>
+          <w:szCs w:val="24"/>
+          <w:u w:val="single"/>
+        </w:rPr>
+        <w:tab/>
+      </w:r>
+      <w:bookmarkStart w:id="0" w:name="_GoBack"/>
+      <w:bookmarkEnd w:id="0"/>
     </w:p>
     <w:p>
       <w:pPr>
@@ -2639,27 +2704,11 @@
     <w:p>
       <w:pPr>
         <w:jc w:val="center"/>
-      </w:pPr>
-      <w:r>
-        <w:t>{{USUARIO_ASSINATURA_MANUAL}}</w:t>
-      </w:r>
-    </w:p>
-    <w:p>
-      <w:pPr>
-        <w:pStyle w:val="Corpodetexto"/>
-        <w:rPr>
-          <w:rFonts w:asciiTheme="majorHAnsi" w:hAnsiTheme="majorHAnsi"/>
-          <w:b/>
-        </w:rPr>
-      </w:pPr>
-    </w:p>
-    <w:p>
-      <w:pPr>
-        <w:pStyle w:val="Corpodetexto"/>
-        <w:spacing w:before="207"/>
-        <w:rPr>
-          <w:rFonts w:asciiTheme="majorHAnsi" w:hAnsiTheme="majorHAnsi"/>
-          <w:b/>
+        <w:rPr>
+          <w:rFonts w:asciiTheme="majorHAnsi" w:hAnsiTheme="majorHAnsi"/>
+          <w:b/>
+          <w:sz w:val="24"/>
+          <w:szCs w:val="24"/>
         </w:rPr>
       </w:pPr>
     </w:p>
@@ -2676,18 +2725,84 @@
       <w:pPr>
         <w:pStyle w:val="Corpodetexto"/>
         <w:spacing w:before="192"/>
-        <w:rPr>
-          <w:rFonts w:asciiTheme="majorHAnsi" w:hAnsiTheme="majorHAnsi"/>
-          <w:b/>
-        </w:rPr>
-      </w:pPr>
-    </w:p>
-    <w:p>
-      <w:pPr>
         <w:jc w:val="center"/>
         <w:rPr>
           <w:rFonts w:asciiTheme="majorHAnsi" w:hAnsiTheme="majorHAnsi"/>
           <w:b/>
+          <w:u w:val="single"/>
+        </w:rPr>
+      </w:pPr>
+      <w:r>
+        <w:rPr>
+          <w:rFonts w:asciiTheme="majorHAnsi" w:hAnsiTheme="majorHAnsi"/>
+          <w:b/>
+          <w:u w:val="single"/>
+        </w:rPr>
+        <w:tab/>
+      </w:r>
+      <w:r>
+        <w:rPr>
+          <w:rFonts w:asciiTheme="majorHAnsi" w:hAnsiTheme="majorHAnsi"/>
+          <w:b/>
+          <w:u w:val="single"/>
+        </w:rPr>
+        <w:tab/>
+      </w:r>
+      <w:r>
+        <w:rPr>
+          <w:rFonts w:asciiTheme="majorHAnsi" w:hAnsiTheme="majorHAnsi"/>
+          <w:b/>
+          <w:u w:val="single"/>
+        </w:rPr>
+        <w:tab/>
+      </w:r>
+      <w:r>
+        <w:rPr>
+          <w:rFonts w:asciiTheme="majorHAnsi" w:hAnsiTheme="majorHAnsi"/>
+          <w:b/>
+          <w:u w:val="single"/>
+        </w:rPr>
+        <w:tab/>
+      </w:r>
+      <w:r>
+        <w:rPr>
+          <w:rFonts w:asciiTheme="majorHAnsi" w:hAnsiTheme="majorHAnsi"/>
+          <w:b/>
+          <w:u w:val="single"/>
+        </w:rPr>
+        <w:tab/>
+      </w:r>
+      <w:r>
+        <w:rPr>
+          <w:rFonts w:asciiTheme="majorHAnsi" w:hAnsiTheme="majorHAnsi"/>
+          <w:b/>
+          <w:u w:val="single"/>
+        </w:rPr>
+        <w:tab/>
+      </w:r>
+      <w:r>
+        <w:rPr>
+          <w:rFonts w:asciiTheme="majorHAnsi" w:hAnsiTheme="majorHAnsi"/>
+          <w:b/>
+          <w:u w:val="single"/>
+        </w:rPr>
+        <w:tab/>
+      </w:r>
+      <w:r>
+        <w:rPr>
+          <w:rFonts w:asciiTheme="majorHAnsi" w:hAnsiTheme="majorHAnsi"/>
+          <w:b/>
+          <w:u w:val="single"/>
+        </w:rPr>
+        <w:tab/>
+      </w:r>
+    </w:p>
+    <w:p>
+      <w:pPr>
+        <w:jc w:val="center"/>
+        <w:rPr>
+          <w:rFonts w:asciiTheme="majorHAnsi" w:hAnsiTheme="majorHAnsi"/>
+          <w:b/>
           <w:sz w:val="24"/>
           <w:szCs w:val="24"/>
         </w:rPr>
@@ -2741,35 +2856,25 @@
     </w:p>
     <w:p>
       <w:pPr>
-        <w:jc w:val="center"/>
-      </w:pPr>
-      <w:r>
-        <w:t>{{COMPRADOR_ASSINATURA_MANUAL}}</w:t>
-      </w:r>
-    </w:p>
-    <w:p>
-      <w:pPr>
-        <w:jc w:val="both"/>
-        <w:rPr>
-          <w:rFonts w:asciiTheme="majorHAnsi" w:hAnsiTheme="majorHAnsi"/>
-          <w:b/>
-          <w:sz w:val="24"/>
-          <w:szCs w:val="24"/>
-        </w:rPr>
-      </w:pPr>
-    </w:p>
-    <w:p>
-      <w:pPr>
-        <w:jc w:val="both"/>
-        <w:rPr>
-          <w:rFonts w:asciiTheme="majorHAnsi" w:hAnsiTheme="majorHAnsi"/>
-          <w:b/>
-          <w:sz w:val="24"/>
-          <w:szCs w:val="24"/>
-        </w:rPr>
-      </w:pPr>
-      <w:bookmarkStart w:id="0" w:name="_GoBack"/>
-      <w:bookmarkEnd w:id="0"/>
+        <w:jc w:val="both"/>
+        <w:rPr>
+          <w:rFonts w:asciiTheme="majorHAnsi" w:hAnsiTheme="majorHAnsi"/>
+          <w:b/>
+          <w:sz w:val="24"/>
+          <w:szCs w:val="24"/>
+        </w:rPr>
+      </w:pPr>
+    </w:p>
+    <w:p>
+      <w:pPr>
+        <w:jc w:val="both"/>
+        <w:rPr>
+          <w:rFonts w:asciiTheme="majorHAnsi" w:hAnsiTheme="majorHAnsi"/>
+          <w:b/>
+          <w:sz w:val="24"/>
+          <w:szCs w:val="24"/>
+        </w:rPr>
+      </w:pPr>
     </w:p>
     <w:p>
       <w:pPr>
@@ -4543,7 +4648,7 @@
 </file>
 
 <file path=customXml/itemProps1.xml><?xml version="1.0" encoding="utf-8"?>
-<ds:datastoreItem xmlns:ds="http://schemas.openxmlformats.org/officeDocument/2006/customXml" ds:itemID="{A4A9C0EC-2096-431D-93A3-F2BC9177D11C}">
+<ds:datastoreItem xmlns:ds="http://schemas.openxmlformats.org/officeDocument/2006/customXml" ds:itemID="{FE517814-4E3C-4191-A71B-49072594D347}">
   <ds:schemaRefs>
     <ds:schemaRef ds:uri="http://schemas.openxmlformats.org/officeDocument/2006/bibliography"/>
   </ds:schemaRefs>

</xml_diff>